<commit_message>
TEST TREN CAM OK
</commit_message>
<xml_diff>
--- a/ESP8266/Arduino/NAS/Doc.docx
+++ b/ESP8266/Arduino/NAS/Doc.docx
@@ -2,6 +2,849 @@
 <file path=word/document.xml><?xml version="1.0" encoding="utf-8"?>
 <w:document xmlns:wpc="http://schemas.microsoft.com/office/word/2010/wordprocessingCanvas" xmlns:cx="http://schemas.microsoft.com/office/drawing/2014/chartex" xmlns:cx1="http://schemas.microsoft.com/office/drawing/2015/9/8/chartex" xmlns:cx2="http://schemas.microsoft.com/office/drawing/2015/10/21/chartex" xmlns:cx3="http://schemas.microsoft.com/office/drawing/2016/5/9/chartex" xmlns:cx4="http://schemas.microsoft.com/office/drawing/2016/5/10/chartex" xmlns:cx5="http://schemas.microsoft.com/office/drawing/2016/5/11/chartex" xmlns:cx6="http://schemas.microsoft.com/office/drawing/2016/5/12/chartex" xmlns:cx7="http://schemas.microsoft.com/office/drawing/2016/5/13/chartex" xmlns:cx8="http://schemas.microsoft.com/office/drawing/2016/5/14/chartex" xmlns:mc="http://schemas.openxmlformats.org/markup-compatibility/2006" xmlns:aink="http://schemas.microsoft.com/office/drawing/2016/ink" xmlns:am3d="http://schemas.microsoft.com/office/drawing/2017/model3d" xmlns:o="urn:schemas-microsoft-com:office:office" xmlns:r="http://schemas.openxmlformats.org/officeDocument/2006/relationships" xmlns:m="http://schemas.openxmlformats.org/officeDocument/2006/math" xmlns:v="urn:schemas-microsoft-com:vml" xmlns:wp14="http://schemas.microsoft.com/office/word/2010/wordprocessingDrawing" xmlns:wp="http://schemas.openxmlformats.org/drawingml/2006/wordprocessingDrawing" xmlns:w10="urn:schemas-microsoft-com:office:word" xmlns:w="http://schemas.openxmlformats.org/wordprocessingml/2006/main" xmlns:w14="http://schemas.microsoft.com/office/word/2010/wordml" xmlns:w15="http://schemas.microsoft.com/office/word/2012/wordml" xmlns:w16cex="http://schemas.microsoft.com/office/word/2018/wordml/cex" xmlns:w16cid="http://schemas.microsoft.com/office/word/2016/wordml/cid" xmlns:w16="http://schemas.microsoft.com/office/word/2018/wordml" xmlns:w16sdtdh="http://schemas.microsoft.com/office/word/2020/wordml/sdtdatahash" xmlns:w16se="http://schemas.microsoft.com/office/word/2015/wordml/symex" xmlns:wpg="http://schemas.microsoft.com/office/word/2010/wordprocessingGroup" xmlns:wpi="http://schemas.microsoft.com/office/word/2010/wordprocessingInk" xmlns:wne="http://schemas.microsoft.com/office/word/2006/wordml" xmlns:wps="http://schemas.microsoft.com/office/word/2010/wordprocessingShape" mc:Ignorable="w14 w15 w16se w16cid w16 w16cex w16sdtdh wp14">
   <w:body>
+    <w:p>
+      <w:pPr>
+        <w:shd w:val="clear" w:color="auto" w:fill="FFFFFF"/>
+        <w:spacing w:line="285" w:lineRule="atLeast"/>
+        <w:rPr>
+          <w:rFonts w:ascii="Consolas" w:eastAsia="Times New Roman" w:hAnsi="Consolas" w:cs="Times New Roman"/>
+          <w:color w:val="000000"/>
+          <w:sz w:val="21"/>
+          <w:szCs w:val="21"/>
+        </w:rPr>
+      </w:pPr>
+      <w:r>
+        <w:rPr>
+          <w:rFonts w:ascii="Times New Roman" w:eastAsia="Times New Roman" w:hAnsi="Times New Roman" w:cs="Times New Roman"/>
+          <w:sz w:val="24"/>
+          <w:szCs w:val="24"/>
+        </w:rPr>
+        <w:t xml:space="preserve">- </w:t>
+      </w:r>
+      <w:r>
+        <w:rPr>
+          <w:rFonts w:ascii="Consolas" w:eastAsia="Times New Roman" w:hAnsi="Consolas" w:cs="Times New Roman"/>
+          <w:color w:val="0000FF"/>
+          <w:sz w:val="21"/>
+          <w:szCs w:val="21"/>
+        </w:rPr>
+        <w:t>function</w:t>
+      </w:r>
+      <w:r>
+        <w:rPr>
+          <w:rFonts w:ascii="Consolas" w:eastAsia="Times New Roman" w:hAnsi="Consolas" w:cs="Times New Roman"/>
+          <w:color w:val="000000"/>
+          <w:sz w:val="21"/>
+          <w:szCs w:val="21"/>
+        </w:rPr>
+        <w:t xml:space="preserve"> </w:t>
+      </w:r>
+      <w:r>
+        <w:rPr>
+          <w:rFonts w:ascii="Consolas" w:eastAsia="Times New Roman" w:hAnsi="Consolas" w:cs="Times New Roman"/>
+          <w:color w:val="795E26"/>
+          <w:sz w:val="21"/>
+          <w:szCs w:val="21"/>
+        </w:rPr>
+        <w:t>doGet</w:t>
+      </w:r>
+      <w:r>
+        <w:rPr>
+          <w:rFonts w:ascii="Consolas" w:eastAsia="Times New Roman" w:hAnsi="Consolas" w:cs="Times New Roman"/>
+          <w:color w:val="000000"/>
+          <w:sz w:val="21"/>
+          <w:szCs w:val="21"/>
+        </w:rPr>
+        <w:t>(</w:t>
+      </w:r>
+      <w:r>
+        <w:rPr>
+          <w:rFonts w:ascii="Consolas" w:eastAsia="Times New Roman" w:hAnsi="Consolas" w:cs="Times New Roman"/>
+          <w:color w:val="001080"/>
+          <w:sz w:val="21"/>
+          <w:szCs w:val="21"/>
+        </w:rPr>
+        <w:t>Data</w:t>
+      </w:r>
+      <w:r>
+        <w:rPr>
+          <w:rFonts w:ascii="Consolas" w:eastAsia="Times New Roman" w:hAnsi="Consolas" w:cs="Times New Roman"/>
+          <w:color w:val="000000"/>
+          <w:sz w:val="21"/>
+          <w:szCs w:val="21"/>
+        </w:rPr>
+        <w:t xml:space="preserve">) </w:t>
+      </w:r>
+    </w:p>
+    <w:p>
+      <w:pPr>
+        <w:spacing w:before="100" w:beforeAutospacing="1" w:after="100" w:afterAutospacing="1" w:line="240" w:lineRule="auto"/>
+        <w:rPr>
+          <w:rFonts w:ascii="Times New Roman" w:eastAsia="Times New Roman" w:hAnsi="Times New Roman" w:cs="Times New Roman"/>
+          <w:sz w:val="24"/>
+          <w:szCs w:val="24"/>
+        </w:rPr>
+      </w:pPr>
+      <w:r>
+        <w:rPr>
+          <w:rFonts w:ascii="Times New Roman" w:eastAsia="Times New Roman" w:hAnsi="Times New Roman" w:cs="Times New Roman"/>
+          <w:sz w:val="24"/>
+          <w:szCs w:val="24"/>
+        </w:rPr>
+        <w:tab/>
+        <w:t xml:space="preserve">Hàm này chạy sẽ kiểm tra các thông số truyền theo tên WEB URL. Nếu không có thông số thì trả nguyên trang WEB, chính vì thế trong lần gọi đầu tiên của người sử dụng sẽ không có truyền các gì khác mà chỉ truyền gởi toàn bộ source code trang WEB. Nếu có thông số thì tùy theo các thông số mà trả về các </w:t>
+      </w:r>
+      <w:r>
+        <w:rPr>
+          <w:rFonts w:ascii="Times New Roman" w:eastAsia="Times New Roman" w:hAnsi="Times New Roman" w:cs="Times New Roman"/>
+          <w:sz w:val="24"/>
+          <w:szCs w:val="24"/>
+        </w:rPr>
+        <w:t>chuỗi</w:t>
+      </w:r>
+      <w:r>
+        <w:rPr>
+          <w:rFonts w:ascii="Times New Roman" w:eastAsia="Times New Roman" w:hAnsi="Times New Roman" w:cs="Times New Roman"/>
+          <w:sz w:val="24"/>
+          <w:szCs w:val="24"/>
+        </w:rPr>
+        <w:t xml:space="preserve"> </w:t>
+      </w:r>
+      <w:r>
+        <w:rPr>
+          <w:rFonts w:ascii="Times New Roman" w:eastAsia="Times New Roman" w:hAnsi="Times New Roman" w:cs="Times New Roman"/>
+          <w:sz w:val="24"/>
+          <w:szCs w:val="24"/>
+        </w:rPr>
+        <w:t>JSON</w:t>
+      </w:r>
+      <w:r>
+        <w:rPr>
+          <w:rFonts w:ascii="Times New Roman" w:eastAsia="Times New Roman" w:hAnsi="Times New Roman" w:cs="Times New Roman"/>
+          <w:sz w:val="24"/>
+          <w:szCs w:val="24"/>
+        </w:rPr>
+        <w:t>.</w:t>
+      </w:r>
+    </w:p>
+    <w:p>
+      <w:pPr>
+        <w:shd w:val="clear" w:color="auto" w:fill="FFFFFF"/>
+        <w:spacing w:line="285" w:lineRule="atLeast"/>
+        <w:rPr>
+          <w:rFonts w:ascii="Consolas" w:eastAsia="Times New Roman" w:hAnsi="Consolas" w:cs="Times New Roman"/>
+          <w:color w:val="000000"/>
+          <w:sz w:val="21"/>
+          <w:szCs w:val="21"/>
+        </w:rPr>
+      </w:pPr>
+      <w:r>
+        <w:rPr>
+          <w:rFonts w:ascii="Times New Roman" w:eastAsia="Times New Roman" w:hAnsi="Times New Roman" w:cs="Times New Roman"/>
+          <w:sz w:val="24"/>
+          <w:szCs w:val="24"/>
+        </w:rPr>
+        <w:tab/>
+        <w:t xml:space="preserve">- Kiểm tra KEY nếu không giống với KEY lưu trên máy chủ thì gởi tin </w:t>
+      </w:r>
+      <w:r>
+        <w:rPr>
+          <w:rFonts w:ascii="Consolas" w:eastAsia="Times New Roman" w:hAnsi="Consolas" w:cs="Times New Roman"/>
+          <w:color w:val="000000"/>
+          <w:sz w:val="21"/>
+          <w:szCs w:val="21"/>
+        </w:rPr>
+        <w:t xml:space="preserve">{ </w:t>
+      </w:r>
+      <w:r>
+        <w:rPr>
+          <w:rFonts w:ascii="Consolas" w:eastAsia="Times New Roman" w:hAnsi="Consolas" w:cs="Times New Roman"/>
+          <w:color w:val="001080"/>
+          <w:sz w:val="21"/>
+          <w:szCs w:val="21"/>
+        </w:rPr>
+        <w:t>STATUS:</w:t>
+      </w:r>
+      <w:r>
+        <w:rPr>
+          <w:rFonts w:ascii="Consolas" w:eastAsia="Times New Roman" w:hAnsi="Consolas" w:cs="Times New Roman"/>
+          <w:color w:val="000000"/>
+          <w:sz w:val="21"/>
+          <w:szCs w:val="21"/>
+        </w:rPr>
+        <w:t xml:space="preserve"> </w:t>
+      </w:r>
+      <w:r>
+        <w:rPr>
+          <w:rFonts w:ascii="Consolas" w:eastAsia="Times New Roman" w:hAnsi="Consolas" w:cs="Times New Roman"/>
+          <w:color w:val="0000FF"/>
+          <w:sz w:val="21"/>
+          <w:szCs w:val="21"/>
+        </w:rPr>
+        <w:t>false</w:t>
+      </w:r>
+      <w:r>
+        <w:rPr>
+          <w:rFonts w:ascii="Consolas" w:eastAsia="Times New Roman" w:hAnsi="Consolas" w:cs="Times New Roman"/>
+          <w:color w:val="000000"/>
+          <w:sz w:val="21"/>
+          <w:szCs w:val="21"/>
+        </w:rPr>
+        <w:t xml:space="preserve">, </w:t>
+      </w:r>
+      <w:r>
+        <w:rPr>
+          <w:rFonts w:ascii="Consolas" w:eastAsia="Times New Roman" w:hAnsi="Consolas" w:cs="Times New Roman"/>
+          <w:color w:val="001080"/>
+          <w:sz w:val="21"/>
+          <w:szCs w:val="21"/>
+        </w:rPr>
+        <w:t>ERROR:</w:t>
+      </w:r>
+      <w:r>
+        <w:rPr>
+          <w:rFonts w:ascii="Consolas" w:eastAsia="Times New Roman" w:hAnsi="Consolas" w:cs="Times New Roman"/>
+          <w:color w:val="000000"/>
+          <w:sz w:val="21"/>
+          <w:szCs w:val="21"/>
+        </w:rPr>
+        <w:t xml:space="preserve"> </w:t>
+      </w:r>
+      <w:r>
+        <w:rPr>
+          <w:rFonts w:ascii="Consolas" w:eastAsia="Times New Roman" w:hAnsi="Consolas" w:cs="Times New Roman"/>
+          <w:color w:val="A31515"/>
+          <w:sz w:val="21"/>
+          <w:szCs w:val="21"/>
+        </w:rPr>
+        <w:t>"Unauthorized"</w:t>
+      </w:r>
+      <w:r>
+        <w:rPr>
+          <w:rFonts w:ascii="Consolas" w:eastAsia="Times New Roman" w:hAnsi="Consolas" w:cs="Times New Roman"/>
+          <w:color w:val="000000"/>
+          <w:sz w:val="21"/>
+          <w:szCs w:val="21"/>
+        </w:rPr>
+        <w:t xml:space="preserve"> }</w:t>
+      </w:r>
+    </w:p>
+    <w:p>
+      <w:pPr>
+        <w:shd w:val="clear" w:color="auto" w:fill="FFFFFF"/>
+        <w:spacing w:line="285" w:lineRule="atLeast"/>
+        <w:rPr>
+          <w:rFonts w:ascii="Consolas" w:eastAsia="Times New Roman" w:hAnsi="Consolas" w:cs="Times New Roman"/>
+          <w:color w:val="A31515"/>
+          <w:sz w:val="21"/>
+          <w:szCs w:val="21"/>
+        </w:rPr>
+      </w:pPr>
+      <w:r>
+        <w:rPr>
+          <w:rFonts w:ascii="Times New Roman" w:eastAsia="Times New Roman" w:hAnsi="Times New Roman" w:cs="Times New Roman"/>
+          <w:sz w:val="24"/>
+          <w:szCs w:val="24"/>
+        </w:rPr>
+        <w:tab/>
+        <w:t xml:space="preserve">- Nếu thông số là </w:t>
+      </w:r>
+      <w:r>
+        <w:rPr>
+          <w:rFonts w:ascii="Consolas" w:eastAsia="Times New Roman" w:hAnsi="Consolas" w:cs="Times New Roman"/>
+          <w:color w:val="A31515"/>
+          <w:sz w:val="21"/>
+          <w:szCs w:val="21"/>
+        </w:rPr>
+        <w:t>POLL</w:t>
+      </w:r>
+    </w:p>
+    <w:p>
+      <w:pPr>
+        <w:shd w:val="clear" w:color="auto" w:fill="FFFFFF"/>
+        <w:spacing w:line="285" w:lineRule="atLeast"/>
+        <w:rPr>
+          <w:rFonts w:ascii="Consolas" w:eastAsia="Times New Roman" w:hAnsi="Consolas" w:cs="Times New Roman"/>
+          <w:color w:val="A31515"/>
+          <w:sz w:val="21"/>
+          <w:szCs w:val="21"/>
+        </w:rPr>
+      </w:pPr>
+    </w:p>
+    <w:p>
+      <w:pPr>
+        <w:shd w:val="clear" w:color="auto" w:fill="FFFFFF"/>
+        <w:spacing w:line="285" w:lineRule="atLeast"/>
+        <w:rPr>
+          <w:rFonts w:ascii="Consolas" w:eastAsia="Times New Roman" w:hAnsi="Consolas" w:cs="Times New Roman"/>
+          <w:color w:val="A31515"/>
+          <w:sz w:val="21"/>
+          <w:szCs w:val="21"/>
+        </w:rPr>
+      </w:pPr>
+    </w:p>
+    <w:p>
+      <w:pPr>
+        <w:shd w:val="clear" w:color="auto" w:fill="FFFFFF"/>
+        <w:spacing w:line="285" w:lineRule="atLeast"/>
+        <w:rPr>
+          <w:rFonts w:ascii="Consolas" w:eastAsia="Times New Roman" w:hAnsi="Consolas" w:cs="Times New Roman"/>
+          <w:color w:val="A31515"/>
+          <w:sz w:val="21"/>
+          <w:szCs w:val="21"/>
+        </w:rPr>
+      </w:pPr>
+    </w:p>
+    <w:p>
+      <w:pPr>
+        <w:shd w:val="clear" w:color="auto" w:fill="FFFFFF"/>
+        <w:spacing w:line="285" w:lineRule="atLeast"/>
+        <w:rPr>
+          <w:rFonts w:ascii="Consolas" w:eastAsia="Times New Roman" w:hAnsi="Consolas" w:cs="Times New Roman"/>
+          <w:color w:val="A31515"/>
+          <w:sz w:val="21"/>
+          <w:szCs w:val="21"/>
+        </w:rPr>
+      </w:pPr>
+    </w:p>
+    <w:p>
+      <w:pPr>
+        <w:shd w:val="clear" w:color="auto" w:fill="FFFFFF"/>
+        <w:spacing w:line="285" w:lineRule="atLeast"/>
+        <w:rPr>
+          <w:rFonts w:ascii="Consolas" w:eastAsia="Times New Roman" w:hAnsi="Consolas" w:cs="Times New Roman"/>
+          <w:color w:val="000000"/>
+          <w:sz w:val="21"/>
+          <w:szCs w:val="21"/>
+        </w:rPr>
+      </w:pPr>
+      <w:r>
+        <w:rPr>
+          <w:rFonts w:ascii="Consolas" w:eastAsia="Times New Roman" w:hAnsi="Consolas" w:cs="Times New Roman"/>
+          <w:color w:val="000000"/>
+          <w:sz w:val="21"/>
+          <w:szCs w:val="21"/>
+        </w:rPr>
+        <w:t>let countdownInterval; // Biến lưu bộ đếm thời gian</w:t>
+      </w:r>
+    </w:p>
+    <w:p>
+      <w:pPr>
+        <w:shd w:val="clear" w:color="auto" w:fill="FFFFFF"/>
+        <w:spacing w:line="285" w:lineRule="atLeast"/>
+        <w:rPr>
+          <w:rFonts w:ascii="Consolas" w:eastAsia="Times New Roman" w:hAnsi="Consolas" w:cs="Times New Roman"/>
+          <w:color w:val="000000"/>
+          <w:sz w:val="21"/>
+          <w:szCs w:val="21"/>
+        </w:rPr>
+      </w:pPr>
+    </w:p>
+    <w:p>
+      <w:pPr>
+        <w:shd w:val="clear" w:color="auto" w:fill="FFFFFF"/>
+        <w:spacing w:line="285" w:lineRule="atLeast"/>
+        <w:rPr>
+          <w:rFonts w:ascii="Consolas" w:eastAsia="Times New Roman" w:hAnsi="Consolas" w:cs="Times New Roman"/>
+          <w:color w:val="000000"/>
+          <w:sz w:val="21"/>
+          <w:szCs w:val="21"/>
+        </w:rPr>
+      </w:pPr>
+      <w:r>
+        <w:rPr>
+          <w:rFonts w:ascii="Consolas" w:eastAsia="Times New Roman" w:hAnsi="Consolas" w:cs="Times New Roman"/>
+          <w:color w:val="000000"/>
+          <w:sz w:val="21"/>
+          <w:szCs w:val="21"/>
+        </w:rPr>
+        <w:t>function startCountdown(seconds) {</w:t>
+      </w:r>
+    </w:p>
+    <w:p>
+      <w:pPr>
+        <w:shd w:val="clear" w:color="auto" w:fill="FFFFFF"/>
+        <w:spacing w:line="285" w:lineRule="atLeast"/>
+        <w:rPr>
+          <w:rFonts w:ascii="Consolas" w:eastAsia="Times New Roman" w:hAnsi="Consolas" w:cs="Times New Roman"/>
+          <w:color w:val="000000"/>
+          <w:sz w:val="21"/>
+          <w:szCs w:val="21"/>
+        </w:rPr>
+      </w:pPr>
+      <w:r>
+        <w:rPr>
+          <w:rFonts w:ascii="Consolas" w:eastAsia="Times New Roman" w:hAnsi="Consolas" w:cs="Times New Roman"/>
+          <w:color w:val="000000"/>
+          <w:sz w:val="21"/>
+          <w:szCs w:val="21"/>
+        </w:rPr>
+        <w:t xml:space="preserve">    // Xóa bộ đếm cũ nếu đang chạy</w:t>
+      </w:r>
+    </w:p>
+    <w:p>
+      <w:pPr>
+        <w:shd w:val="clear" w:color="auto" w:fill="FFFFFF"/>
+        <w:spacing w:line="285" w:lineRule="atLeast"/>
+        <w:rPr>
+          <w:rFonts w:ascii="Consolas" w:eastAsia="Times New Roman" w:hAnsi="Consolas" w:cs="Times New Roman"/>
+          <w:color w:val="000000"/>
+          <w:sz w:val="21"/>
+          <w:szCs w:val="21"/>
+        </w:rPr>
+      </w:pPr>
+      <w:r>
+        <w:rPr>
+          <w:rFonts w:ascii="Consolas" w:eastAsia="Times New Roman" w:hAnsi="Consolas" w:cs="Times New Roman"/>
+          <w:color w:val="000000"/>
+          <w:sz w:val="21"/>
+          <w:szCs w:val="21"/>
+        </w:rPr>
+        <w:t xml:space="preserve">    if (countdownInterval) {</w:t>
+      </w:r>
+    </w:p>
+    <w:p>
+      <w:pPr>
+        <w:shd w:val="clear" w:color="auto" w:fill="FFFFFF"/>
+        <w:spacing w:line="285" w:lineRule="atLeast"/>
+        <w:rPr>
+          <w:rFonts w:ascii="Consolas" w:eastAsia="Times New Roman" w:hAnsi="Consolas" w:cs="Times New Roman"/>
+          <w:color w:val="000000"/>
+          <w:sz w:val="21"/>
+          <w:szCs w:val="21"/>
+        </w:rPr>
+      </w:pPr>
+      <w:r>
+        <w:rPr>
+          <w:rFonts w:ascii="Consolas" w:eastAsia="Times New Roman" w:hAnsi="Consolas" w:cs="Times New Roman"/>
+          <w:color w:val="000000"/>
+          <w:sz w:val="21"/>
+          <w:szCs w:val="21"/>
+        </w:rPr>
+        <w:t xml:space="preserve">        clearInterval(countdownInterval);</w:t>
+      </w:r>
+    </w:p>
+    <w:p>
+      <w:pPr>
+        <w:shd w:val="clear" w:color="auto" w:fill="FFFFFF"/>
+        <w:spacing w:line="285" w:lineRule="atLeast"/>
+        <w:rPr>
+          <w:rFonts w:ascii="Consolas" w:eastAsia="Times New Roman" w:hAnsi="Consolas" w:cs="Times New Roman"/>
+          <w:color w:val="000000"/>
+          <w:sz w:val="21"/>
+          <w:szCs w:val="21"/>
+        </w:rPr>
+      </w:pPr>
+      <w:r>
+        <w:rPr>
+          <w:rFonts w:ascii="Consolas" w:eastAsia="Times New Roman" w:hAnsi="Consolas" w:cs="Times New Roman"/>
+          <w:color w:val="000000"/>
+          <w:sz w:val="21"/>
+          <w:szCs w:val="21"/>
+        </w:rPr>
+        <w:t xml:space="preserve">    }</w:t>
+      </w:r>
+    </w:p>
+    <w:p>
+      <w:pPr>
+        <w:shd w:val="clear" w:color="auto" w:fill="FFFFFF"/>
+        <w:spacing w:line="285" w:lineRule="atLeast"/>
+        <w:rPr>
+          <w:rFonts w:ascii="Consolas" w:eastAsia="Times New Roman" w:hAnsi="Consolas" w:cs="Times New Roman"/>
+          <w:color w:val="000000"/>
+          <w:sz w:val="21"/>
+          <w:szCs w:val="21"/>
+        </w:rPr>
+      </w:pPr>
+    </w:p>
+    <w:p>
+      <w:pPr>
+        <w:shd w:val="clear" w:color="auto" w:fill="FFFFFF"/>
+        <w:spacing w:line="285" w:lineRule="atLeast"/>
+        <w:rPr>
+          <w:rFonts w:ascii="Consolas" w:eastAsia="Times New Roman" w:hAnsi="Consolas" w:cs="Times New Roman"/>
+          <w:color w:val="000000"/>
+          <w:sz w:val="21"/>
+          <w:szCs w:val="21"/>
+        </w:rPr>
+      </w:pPr>
+      <w:r>
+        <w:rPr>
+          <w:rFonts w:ascii="Consolas" w:eastAsia="Times New Roman" w:hAnsi="Consolas" w:cs="Times New Roman"/>
+          <w:color w:val="000000"/>
+          <w:sz w:val="21"/>
+          <w:szCs w:val="21"/>
+        </w:rPr>
+        <w:t xml:space="preserve">    let remainingTime = seconds;</w:t>
+      </w:r>
+    </w:p>
+    <w:p>
+      <w:pPr>
+        <w:shd w:val="clear" w:color="auto" w:fill="FFFFFF"/>
+        <w:spacing w:line="285" w:lineRule="atLeast"/>
+        <w:rPr>
+          <w:rFonts w:ascii="Consolas" w:eastAsia="Times New Roman" w:hAnsi="Consolas" w:cs="Times New Roman"/>
+          <w:color w:val="000000"/>
+          <w:sz w:val="21"/>
+          <w:szCs w:val="21"/>
+        </w:rPr>
+      </w:pPr>
+    </w:p>
+    <w:p>
+      <w:pPr>
+        <w:shd w:val="clear" w:color="auto" w:fill="FFFFFF"/>
+        <w:spacing w:line="285" w:lineRule="atLeast"/>
+        <w:rPr>
+          <w:rFonts w:ascii="Consolas" w:eastAsia="Times New Roman" w:hAnsi="Consolas" w:cs="Times New Roman"/>
+          <w:color w:val="000000"/>
+          <w:sz w:val="21"/>
+          <w:szCs w:val="21"/>
+        </w:rPr>
+      </w:pPr>
+      <w:r>
+        <w:rPr>
+          <w:rFonts w:ascii="Consolas" w:eastAsia="Times New Roman" w:hAnsi="Consolas" w:cs="Times New Roman"/>
+          <w:color w:val="000000"/>
+          <w:sz w:val="21"/>
+          <w:szCs w:val="21"/>
+        </w:rPr>
+        <w:t xml:space="preserve">    // Cập nhật giao diện đếm ngược mỗi 1 giây (1000ms)</w:t>
+      </w:r>
+    </w:p>
+    <w:p>
+      <w:pPr>
+        <w:shd w:val="clear" w:color="auto" w:fill="FFFFFF"/>
+        <w:spacing w:line="285" w:lineRule="atLeast"/>
+        <w:rPr>
+          <w:rFonts w:ascii="Consolas" w:eastAsia="Times New Roman" w:hAnsi="Consolas" w:cs="Times New Roman"/>
+          <w:color w:val="000000"/>
+          <w:sz w:val="21"/>
+          <w:szCs w:val="21"/>
+        </w:rPr>
+      </w:pPr>
+      <w:r>
+        <w:rPr>
+          <w:rFonts w:ascii="Consolas" w:eastAsia="Times New Roman" w:hAnsi="Consolas" w:cs="Times New Roman"/>
+          <w:color w:val="000000"/>
+          <w:sz w:val="21"/>
+          <w:szCs w:val="21"/>
+        </w:rPr>
+        <w:t xml:space="preserve">    countdownInterval = setInterval(function() {</w:t>
+      </w:r>
+    </w:p>
+    <w:p>
+      <w:pPr>
+        <w:shd w:val="clear" w:color="auto" w:fill="FFFFFF"/>
+        <w:spacing w:line="285" w:lineRule="atLeast"/>
+        <w:rPr>
+          <w:rFonts w:ascii="Consolas" w:eastAsia="Times New Roman" w:hAnsi="Consolas" w:cs="Times New Roman"/>
+          <w:color w:val="000000"/>
+          <w:sz w:val="21"/>
+          <w:szCs w:val="21"/>
+        </w:rPr>
+      </w:pPr>
+      <w:r>
+        <w:rPr>
+          <w:rFonts w:ascii="Consolas" w:eastAsia="Times New Roman" w:hAnsi="Consolas" w:cs="Times New Roman"/>
+          <w:color w:val="000000"/>
+          <w:sz w:val="21"/>
+          <w:szCs w:val="21"/>
+        </w:rPr>
+        <w:t xml:space="preserve">        if (remainingTime &lt;= 0) {</w:t>
+      </w:r>
+    </w:p>
+    <w:p>
+      <w:pPr>
+        <w:shd w:val="clear" w:color="auto" w:fill="FFFFFF"/>
+        <w:spacing w:line="285" w:lineRule="atLeast"/>
+        <w:rPr>
+          <w:rFonts w:ascii="Consolas" w:eastAsia="Times New Roman" w:hAnsi="Consolas" w:cs="Times New Roman"/>
+          <w:color w:val="000000"/>
+          <w:sz w:val="21"/>
+          <w:szCs w:val="21"/>
+        </w:rPr>
+      </w:pPr>
+      <w:r>
+        <w:rPr>
+          <w:rFonts w:ascii="Consolas" w:eastAsia="Times New Roman" w:hAnsi="Consolas" w:cs="Times New Roman"/>
+          <w:color w:val="000000"/>
+          <w:sz w:val="21"/>
+          <w:szCs w:val="21"/>
+        </w:rPr>
+        <w:t xml:space="preserve">            clearInterval(countdownInterval);</w:t>
+      </w:r>
+    </w:p>
+    <w:p>
+      <w:pPr>
+        <w:shd w:val="clear" w:color="auto" w:fill="FFFFFF"/>
+        <w:spacing w:line="285" w:lineRule="atLeast"/>
+        <w:rPr>
+          <w:rFonts w:ascii="Consolas" w:eastAsia="Times New Roman" w:hAnsi="Consolas" w:cs="Times New Roman"/>
+          <w:color w:val="000000"/>
+          <w:sz w:val="21"/>
+          <w:szCs w:val="21"/>
+        </w:rPr>
+      </w:pPr>
+      <w:r>
+        <w:rPr>
+          <w:rFonts w:ascii="Consolas" w:eastAsia="Times New Roman" w:hAnsi="Consolas" w:cs="Times New Roman"/>
+          <w:color w:val="000000"/>
+          <w:sz w:val="21"/>
+          <w:szCs w:val="21"/>
+        </w:rPr>
+        <w:t xml:space="preserve">            console.log("Hết thời gian đếm ngược!");</w:t>
+      </w:r>
+    </w:p>
+    <w:p>
+      <w:pPr>
+        <w:shd w:val="clear" w:color="auto" w:fill="FFFFFF"/>
+        <w:spacing w:line="285" w:lineRule="atLeast"/>
+        <w:rPr>
+          <w:rFonts w:ascii="Consolas" w:eastAsia="Times New Roman" w:hAnsi="Consolas" w:cs="Times New Roman"/>
+          <w:color w:val="000000"/>
+          <w:sz w:val="21"/>
+          <w:szCs w:val="21"/>
+        </w:rPr>
+      </w:pPr>
+      <w:r>
+        <w:rPr>
+          <w:rFonts w:ascii="Consolas" w:eastAsia="Times New Roman" w:hAnsi="Consolas" w:cs="Times New Roman"/>
+          <w:color w:val="000000"/>
+          <w:sz w:val="21"/>
+          <w:szCs w:val="21"/>
+        </w:rPr>
+        <w:t xml:space="preserve">            // Có thể thêm logic xử lý khi hết giờ tại đây</w:t>
+      </w:r>
+    </w:p>
+    <w:p>
+      <w:pPr>
+        <w:shd w:val="clear" w:color="auto" w:fill="FFFFFF"/>
+        <w:spacing w:line="285" w:lineRule="atLeast"/>
+        <w:rPr>
+          <w:rFonts w:ascii="Consolas" w:eastAsia="Times New Roman" w:hAnsi="Consolas" w:cs="Times New Roman"/>
+          <w:color w:val="000000"/>
+          <w:sz w:val="21"/>
+          <w:szCs w:val="21"/>
+        </w:rPr>
+      </w:pPr>
+      <w:r>
+        <w:rPr>
+          <w:rFonts w:ascii="Consolas" w:eastAsia="Times New Roman" w:hAnsi="Consolas" w:cs="Times New Roman"/>
+          <w:color w:val="000000"/>
+          <w:sz w:val="21"/>
+          <w:szCs w:val="21"/>
+        </w:rPr>
+        <w:t xml:space="preserve">        } else {</w:t>
+      </w:r>
+    </w:p>
+    <w:p>
+      <w:pPr>
+        <w:shd w:val="clear" w:color="auto" w:fill="FFFFFF"/>
+        <w:spacing w:line="285" w:lineRule="atLeast"/>
+        <w:rPr>
+          <w:rFonts w:ascii="Consolas" w:eastAsia="Times New Roman" w:hAnsi="Consolas" w:cs="Times New Roman"/>
+          <w:color w:val="000000"/>
+          <w:sz w:val="21"/>
+          <w:szCs w:val="21"/>
+        </w:rPr>
+      </w:pPr>
+      <w:r>
+        <w:rPr>
+          <w:rFonts w:ascii="Consolas" w:eastAsia="Times New Roman" w:hAnsi="Consolas" w:cs="Times New Roman"/>
+          <w:color w:val="000000"/>
+          <w:sz w:val="21"/>
+          <w:szCs w:val="21"/>
+        </w:rPr>
+        <w:t xml:space="preserve">            console.log("Thời gian còn lại: " + remainingTime + " giây");</w:t>
+      </w:r>
+    </w:p>
+    <w:p>
+      <w:pPr>
+        <w:shd w:val="clear" w:color="auto" w:fill="FFFFFF"/>
+        <w:spacing w:line="285" w:lineRule="atLeast"/>
+        <w:rPr>
+          <w:rFonts w:ascii="Consolas" w:eastAsia="Times New Roman" w:hAnsi="Consolas" w:cs="Times New Roman"/>
+          <w:color w:val="000000"/>
+          <w:sz w:val="21"/>
+          <w:szCs w:val="21"/>
+        </w:rPr>
+      </w:pPr>
+      <w:r>
+        <w:rPr>
+          <w:rFonts w:ascii="Consolas" w:eastAsia="Times New Roman" w:hAnsi="Consolas" w:cs="Times New Roman"/>
+          <w:color w:val="000000"/>
+          <w:sz w:val="21"/>
+          <w:szCs w:val="21"/>
+        </w:rPr>
+        <w:lastRenderedPageBreak/>
+        <w:t xml:space="preserve">            // Hiển thị ra giao diện HTML (ví dụ)</w:t>
+      </w:r>
+    </w:p>
+    <w:p>
+      <w:pPr>
+        <w:shd w:val="clear" w:color="auto" w:fill="FFFFFF"/>
+        <w:spacing w:line="285" w:lineRule="atLeast"/>
+        <w:rPr>
+          <w:rFonts w:ascii="Consolas" w:eastAsia="Times New Roman" w:hAnsi="Consolas" w:cs="Times New Roman"/>
+          <w:color w:val="000000"/>
+          <w:sz w:val="21"/>
+          <w:szCs w:val="21"/>
+        </w:rPr>
+      </w:pPr>
+      <w:r>
+        <w:rPr>
+          <w:rFonts w:ascii="Consolas" w:eastAsia="Times New Roman" w:hAnsi="Consolas" w:cs="Times New Roman"/>
+          <w:color w:val="000000"/>
+          <w:sz w:val="21"/>
+          <w:szCs w:val="21"/>
+        </w:rPr>
+        <w:t xml:space="preserve">            // document.getElementById("countdownTimer").textContent = remainingTime + "s";</w:t>
+      </w:r>
+    </w:p>
+    <w:p>
+      <w:pPr>
+        <w:shd w:val="clear" w:color="auto" w:fill="FFFFFF"/>
+        <w:spacing w:line="285" w:lineRule="atLeast"/>
+        <w:rPr>
+          <w:rFonts w:ascii="Consolas" w:eastAsia="Times New Roman" w:hAnsi="Consolas" w:cs="Times New Roman"/>
+          <w:color w:val="000000"/>
+          <w:sz w:val="21"/>
+          <w:szCs w:val="21"/>
+        </w:rPr>
+      </w:pPr>
+      <w:r>
+        <w:rPr>
+          <w:rFonts w:ascii="Consolas" w:eastAsia="Times New Roman" w:hAnsi="Consolas" w:cs="Times New Roman"/>
+          <w:color w:val="000000"/>
+          <w:sz w:val="21"/>
+          <w:szCs w:val="21"/>
+        </w:rPr>
+        <w:t xml:space="preserve">            remainingTime--;</w:t>
+      </w:r>
+    </w:p>
+    <w:p>
+      <w:pPr>
+        <w:shd w:val="clear" w:color="auto" w:fill="FFFFFF"/>
+        <w:spacing w:line="285" w:lineRule="atLeast"/>
+        <w:rPr>
+          <w:rFonts w:ascii="Consolas" w:eastAsia="Times New Roman" w:hAnsi="Consolas" w:cs="Times New Roman"/>
+          <w:color w:val="000000"/>
+          <w:sz w:val="21"/>
+          <w:szCs w:val="21"/>
+        </w:rPr>
+      </w:pPr>
+      <w:r>
+        <w:rPr>
+          <w:rFonts w:ascii="Consolas" w:eastAsia="Times New Roman" w:hAnsi="Consolas" w:cs="Times New Roman"/>
+          <w:color w:val="000000"/>
+          <w:sz w:val="21"/>
+          <w:szCs w:val="21"/>
+        </w:rPr>
+        <w:t xml:space="preserve">        }</w:t>
+      </w:r>
+    </w:p>
+    <w:p>
+      <w:pPr>
+        <w:shd w:val="clear" w:color="auto" w:fill="FFFFFF"/>
+        <w:spacing w:line="285" w:lineRule="atLeast"/>
+        <w:rPr>
+          <w:rFonts w:ascii="Consolas" w:eastAsia="Times New Roman" w:hAnsi="Consolas" w:cs="Times New Roman"/>
+          <w:color w:val="000000"/>
+          <w:sz w:val="21"/>
+          <w:szCs w:val="21"/>
+        </w:rPr>
+      </w:pPr>
+      <w:r>
+        <w:rPr>
+          <w:rFonts w:ascii="Consolas" w:eastAsia="Times New Roman" w:hAnsi="Consolas" w:cs="Times New Roman"/>
+          <w:color w:val="000000"/>
+          <w:sz w:val="21"/>
+          <w:szCs w:val="21"/>
+        </w:rPr>
+        <w:t xml:space="preserve">    }, 1000);</w:t>
+      </w:r>
+    </w:p>
+    <w:p>
+      <w:pPr>
+        <w:shd w:val="clear" w:color="auto" w:fill="FFFFFF"/>
+        <w:spacing w:line="285" w:lineRule="atLeast"/>
+        <w:rPr>
+          <w:rFonts w:ascii="Consolas" w:eastAsia="Times New Roman" w:hAnsi="Consolas" w:cs="Times New Roman"/>
+          <w:color w:val="000000"/>
+          <w:sz w:val="21"/>
+          <w:szCs w:val="21"/>
+        </w:rPr>
+      </w:pPr>
+      <w:r>
+        <w:rPr>
+          <w:rFonts w:ascii="Consolas" w:eastAsia="Times New Roman" w:hAnsi="Consolas" w:cs="Times New Roman"/>
+          <w:color w:val="000000"/>
+          <w:sz w:val="21"/>
+          <w:szCs w:val="21"/>
+        </w:rPr>
+        <w:t>}</w:t>
+      </w:r>
+    </w:p>
+    <w:p>
+      <w:pPr>
+        <w:spacing w:before="100" w:beforeAutospacing="1" w:after="100" w:afterAutospacing="1" w:line="240" w:lineRule="auto"/>
+        <w:rPr>
+          <w:rFonts w:ascii="Times New Roman" w:eastAsia="Times New Roman" w:hAnsi="Times New Roman" w:cs="Times New Roman"/>
+          <w:sz w:val="24"/>
+          <w:szCs w:val="24"/>
+        </w:rPr>
+      </w:pPr>
+    </w:p>
+    <w:p>
+      <w:pPr>
+        <w:spacing w:before="100" w:beforeAutospacing="1" w:after="100" w:afterAutospacing="1" w:line="240" w:lineRule="auto"/>
+        <w:rPr>
+          <w:rFonts w:ascii="Times New Roman" w:eastAsia="Times New Roman" w:hAnsi="Times New Roman" w:cs="Times New Roman"/>
+          <w:sz w:val="24"/>
+          <w:szCs w:val="24"/>
+        </w:rPr>
+      </w:pPr>
+    </w:p>
+    <w:p>
+      <w:pPr>
+        <w:spacing w:before="100" w:beforeAutospacing="1" w:after="100" w:afterAutospacing="1" w:line="240" w:lineRule="auto"/>
+        <w:rPr>
+          <w:rFonts w:ascii="Times New Roman" w:eastAsia="Times New Roman" w:hAnsi="Times New Roman" w:cs="Times New Roman"/>
+          <w:sz w:val="24"/>
+          <w:szCs w:val="24"/>
+        </w:rPr>
+      </w:pPr>
+    </w:p>
+    <w:p>
+      <w:pPr>
+        <w:spacing w:before="100" w:beforeAutospacing="1" w:after="100" w:afterAutospacing="1" w:line="240" w:lineRule="auto"/>
+        <w:rPr>
+          <w:rFonts w:ascii="Times New Roman" w:eastAsia="Times New Roman" w:hAnsi="Times New Roman" w:cs="Times New Roman"/>
+          <w:sz w:val="24"/>
+          <w:szCs w:val="24"/>
+        </w:rPr>
+      </w:pPr>
+    </w:p>
+    <w:p>
+      <w:pPr>
+        <w:spacing w:before="100" w:beforeAutospacing="1" w:after="100" w:afterAutospacing="1" w:line="240" w:lineRule="auto"/>
+        <w:rPr>
+          <w:rFonts w:ascii="Times New Roman" w:eastAsia="Times New Roman" w:hAnsi="Times New Roman" w:cs="Times New Roman"/>
+          <w:sz w:val="24"/>
+          <w:szCs w:val="24"/>
+        </w:rPr>
+      </w:pPr>
+    </w:p>
+    <w:p>
+      <w:pPr>
+        <w:spacing w:before="100" w:beforeAutospacing="1" w:after="100" w:afterAutospacing="1" w:line="240" w:lineRule="auto"/>
+        <w:rPr>
+          <w:rFonts w:ascii="Times New Roman" w:eastAsia="Times New Roman" w:hAnsi="Times New Roman" w:cs="Times New Roman"/>
+          <w:sz w:val="24"/>
+          <w:szCs w:val="24"/>
+        </w:rPr>
+      </w:pPr>
+    </w:p>
     <w:p>
       <w:pPr>
         <w:spacing w:before="100" w:beforeAutospacing="1" w:after="100" w:afterAutospacing="1" w:line="240" w:lineRule="auto"/>
@@ -504,6 +1347,7 @@
           <w:sz w:val="24"/>
           <w:szCs w:val="24"/>
         </w:rPr>
+        <w:lastRenderedPageBreak/>
         <w:t>Nếu sai PIN:</w:t>
       </w:r>
       <w:r>
@@ -988,7 +1832,6 @@
           <w:sz w:val="24"/>
           <w:szCs w:val="24"/>
         </w:rPr>
-        <w:lastRenderedPageBreak/>
         <w:t>(Giai đoạn này diễn ra độc lập thông qua thiết bị ESP)</w:t>
       </w:r>
     </w:p>
@@ -1354,6 +2197,7 @@
         <w:pStyle w:val="Heading4"/>
       </w:pPr>
       <w:r>
+        <w:lastRenderedPageBreak/>
         <w:t>1. Tại Server (Google Apps Script)</w:t>
       </w:r>
     </w:p>
@@ -2229,6 +3073,118 @@
     </w:lvl>
   </w:abstractNum>
   <w:abstractNum w:abstractNumId="6" w15:restartNumberingAfterBreak="0">
+    <w:nsid w:val="67B7185A"/>
+    <w:multiLevelType w:val="hybridMultilevel"/>
+    <w:tmpl w:val="C5ECA5DE"/>
+    <w:lvl w:ilvl="0" w:tplc="2382B204">
+      <w:numFmt w:val="bullet"/>
+      <w:lvlText w:val="-"/>
+      <w:lvlJc w:val="left"/>
+      <w:pPr>
+        <w:ind w:left="1080" w:hanging="360"/>
+      </w:pPr>
+      <w:rPr>
+        <w:rFonts w:ascii="Times New Roman" w:eastAsia="Times New Roman" w:hAnsi="Times New Roman" w:cs="Times New Roman" w:hint="default"/>
+      </w:rPr>
+    </w:lvl>
+    <w:lvl w:ilvl="1" w:tplc="04090003" w:tentative="1">
+      <w:start w:val="1"/>
+      <w:numFmt w:val="bullet"/>
+      <w:lvlText w:val="o"/>
+      <w:lvlJc w:val="left"/>
+      <w:pPr>
+        <w:ind w:left="1800" w:hanging="360"/>
+      </w:pPr>
+      <w:rPr>
+        <w:rFonts w:ascii="Courier New" w:hAnsi="Courier New" w:cs="Courier New" w:hint="default"/>
+      </w:rPr>
+    </w:lvl>
+    <w:lvl w:ilvl="2" w:tplc="04090005" w:tentative="1">
+      <w:start w:val="1"/>
+      <w:numFmt w:val="bullet"/>
+      <w:lvlText w:val=""/>
+      <w:lvlJc w:val="left"/>
+      <w:pPr>
+        <w:ind w:left="2520" w:hanging="360"/>
+      </w:pPr>
+      <w:rPr>
+        <w:rFonts w:ascii="Wingdings" w:hAnsi="Wingdings" w:hint="default"/>
+      </w:rPr>
+    </w:lvl>
+    <w:lvl w:ilvl="3" w:tplc="04090001" w:tentative="1">
+      <w:start w:val="1"/>
+      <w:numFmt w:val="bullet"/>
+      <w:lvlText w:val=""/>
+      <w:lvlJc w:val="left"/>
+      <w:pPr>
+        <w:ind w:left="3240" w:hanging="360"/>
+      </w:pPr>
+      <w:rPr>
+        <w:rFonts w:ascii="Symbol" w:hAnsi="Symbol" w:hint="default"/>
+      </w:rPr>
+    </w:lvl>
+    <w:lvl w:ilvl="4" w:tplc="04090003" w:tentative="1">
+      <w:start w:val="1"/>
+      <w:numFmt w:val="bullet"/>
+      <w:lvlText w:val="o"/>
+      <w:lvlJc w:val="left"/>
+      <w:pPr>
+        <w:ind w:left="3960" w:hanging="360"/>
+      </w:pPr>
+      <w:rPr>
+        <w:rFonts w:ascii="Courier New" w:hAnsi="Courier New" w:cs="Courier New" w:hint="default"/>
+      </w:rPr>
+    </w:lvl>
+    <w:lvl w:ilvl="5" w:tplc="04090005" w:tentative="1">
+      <w:start w:val="1"/>
+      <w:numFmt w:val="bullet"/>
+      <w:lvlText w:val=""/>
+      <w:lvlJc w:val="left"/>
+      <w:pPr>
+        <w:ind w:left="4680" w:hanging="360"/>
+      </w:pPr>
+      <w:rPr>
+        <w:rFonts w:ascii="Wingdings" w:hAnsi="Wingdings" w:hint="default"/>
+      </w:rPr>
+    </w:lvl>
+    <w:lvl w:ilvl="6" w:tplc="04090001" w:tentative="1">
+      <w:start w:val="1"/>
+      <w:numFmt w:val="bullet"/>
+      <w:lvlText w:val=""/>
+      <w:lvlJc w:val="left"/>
+      <w:pPr>
+        <w:ind w:left="5400" w:hanging="360"/>
+      </w:pPr>
+      <w:rPr>
+        <w:rFonts w:ascii="Symbol" w:hAnsi="Symbol" w:hint="default"/>
+      </w:rPr>
+    </w:lvl>
+    <w:lvl w:ilvl="7" w:tplc="04090003" w:tentative="1">
+      <w:start w:val="1"/>
+      <w:numFmt w:val="bullet"/>
+      <w:lvlText w:val="o"/>
+      <w:lvlJc w:val="left"/>
+      <w:pPr>
+        <w:ind w:left="6120" w:hanging="360"/>
+      </w:pPr>
+      <w:rPr>
+        <w:rFonts w:ascii="Courier New" w:hAnsi="Courier New" w:cs="Courier New" w:hint="default"/>
+      </w:rPr>
+    </w:lvl>
+    <w:lvl w:ilvl="8" w:tplc="04090005" w:tentative="1">
+      <w:start w:val="1"/>
+      <w:numFmt w:val="bullet"/>
+      <w:lvlText w:val=""/>
+      <w:lvlJc w:val="left"/>
+      <w:pPr>
+        <w:ind w:left="6840" w:hanging="360"/>
+      </w:pPr>
+      <w:rPr>
+        <w:rFonts w:ascii="Wingdings" w:hAnsi="Wingdings" w:hint="default"/>
+      </w:rPr>
+    </w:lvl>
+  </w:abstractNum>
+  <w:abstractNum w:abstractNumId="7" w15:restartNumberingAfterBreak="0">
     <w:nsid w:val="6E4D4E5A"/>
     <w:multiLevelType w:val="multilevel"/>
     <w:tmpl w:val="24F8A4A8"/>
@@ -2393,10 +3349,13 @@
     <w:abstractNumId w:val="2"/>
   </w:num>
   <w:num w:numId="6">
-    <w:abstractNumId w:val="6"/>
+    <w:abstractNumId w:val="7"/>
   </w:num>
   <w:num w:numId="7">
     <w:abstractNumId w:val="1"/>
+  </w:num>
+  <w:num w:numId="8">
+    <w:abstractNumId w:val="6"/>
   </w:num>
 </w:numbering>
 </file>
@@ -2987,6 +3946,17 @@
       <w:color w:val="2F5496" w:themeColor="accent1" w:themeShade="BF"/>
     </w:rPr>
   </w:style>
+  <w:style w:type="paragraph" w:styleId="ListParagraph">
+    <w:name w:val="List Paragraph"/>
+    <w:basedOn w:val="Normal"/>
+    <w:uiPriority w:val="34"/>
+    <w:qFormat/>
+    <w:rsid w:val="00047B25"/>
+    <w:pPr>
+      <w:ind w:left="720"/>
+      <w:contextualSpacing/>
+    </w:pPr>
+  </w:style>
 </w:styles>
 </file>
 

</xml_diff>